<commit_message>
fix: DOCX export — centered title, styled code, risk paragraphs, footer
Post-processing improvements based on visual review:
- Title/subtitle centered via OOXML post-processing (pandoc ignores \begin{center})
- Code style: 8pt, SectionBlue, bold (was oversized default monospace)
- Risk assessment: paragraph layout instead of squeezed table
- Footer: "Stage: Hypothesis v3.1" from \prfaqstage/\prfaqversion metadata
- Page breaks before Risk Assessment and Feature Appendix sections
- Stage metadata removed from body (now in footer only)
- Fixed sed escaping for titles containing slashes (PR/FAQ)
- Resolved absolute path for WORK_DIR/OUTPUT to prevent cd breakage

Co-Authored-By: Claude Opus 4.6 <noreply@anthropic.com>
</commit_message>
<xml_diff>
--- a/assets/reference.docx
+++ b/assets/reference.docx
@@ -314,6 +314,9 @@
       </w:r>
     </w:p>
     <w:sectPr>
+      <w:footerReference w:type="default" r:id="rIdFooter1"/>
+    </w:sectPr>
+    <w:sectPr>
       <w:headerReference w:type="default" r:id="rIdHeader1"/>
     </w:sectPr>
     <w:sectPr>
@@ -327,6 +330,27 @@
 
 <file path=word/comments.xml><?xml version="1.0" encoding="utf-8"?>
 <w:comments xmlns:w="http://schemas.openxmlformats.org/wordprocessingml/2006/main" xmlns:m="http://schemas.openxmlformats.org/officeDocument/2006/math" xmlns:r="http://schemas.openxmlformats.org/officeDocument/2006/relationships" xmlns:o="urn:schemas-microsoft-com:office:office" xmlns:v="urn:schemas-microsoft-com:vml" xmlns:w10="urn:schemas-microsoft-com:office:word" xmlns:a="http://schemas.openxmlformats.org/drawingml/2006/main" xmlns:pic="http://schemas.openxmlformats.org/drawingml/2006/picture" xmlns:wp="http://schemas.openxmlformats.org/drawingml/2006/wordprocessingDrawing"/>
+</file>
+
+<file path=word/footer1.xml><?xml version="1.0" encoding="utf-8"?>
+<w:ftr xmlns:w="http://schemas.openxmlformats.org/wordprocessingml/2006/main" xmlns:r="http://schemas.openxmlformats.org/officeDocument/2006/relationships">
+  <w:p>
+    <w:pPr>
+      <w:jc w:val="center"/>
+      <w:rPr>
+        <w:color w:val="999999"/>
+        <w:sz w:val="16"/>
+      </w:rPr>
+    </w:pPr>
+    <w:r>
+      <w:rPr>
+        <w:color w:val="999999"/>
+        <w:sz w:val="16"/>
+      </w:rPr>
+      <w:t>{{STAGE}}</w:t>
+    </w:r>
+  </w:p>
+</w:ftr>
 </file>
 
 <file path=word/footnotes.xml><?xml version="1.0" encoding="utf-8"?>
@@ -1134,7 +1158,10 @@
     <w:basedOn w:val="BodyTextChar"/>
     <w:rPr>
       <w:rFonts w:ascii="Consolas" w:hAnsi="Consolas"/>
-      <w:sz w:val="22"/>
+      <w:sz w:val="16"/>
+      <w:szCs w:val="16"/>
+      <w:color w:val="1B3A5C"/>
+      <w:b/>
     </w:rPr>
   </w:style>
   <w:style w:type="character" w:customStyle="1" w:styleId="SectionNumber">

</xml_diff>